<commit_message>
MaJ de TP-intra flutter pub
</commit_message>
<xml_diff>
--- a/lettre_motivation_bouse-perseverance.docx
+++ b/lettre_motivation_bouse-perseverance.docx
@@ -1,9 +1,10 @@
 
 <file path=word/document.xml><?xml version="1.0" encoding="utf-8"?>
-<w:document xmlns:wpc="http://schemas.microsoft.com/office/word/2010/wordprocessingCanvas" xmlns:cx="http://schemas.microsoft.com/office/drawing/2014/chartex" xmlns:cx1="http://schemas.microsoft.com/office/drawing/2015/9/8/chartex" xmlns:cx2="http://schemas.microsoft.com/office/drawing/2015/10/21/chartex" xmlns:cx3="http://schemas.microsoft.com/office/drawing/2016/5/9/chartex" xmlns:cx4="http://schemas.microsoft.com/office/drawing/2016/5/10/chartex" xmlns:cx5="http://schemas.microsoft.com/office/drawing/2016/5/11/chartex" xmlns:cx6="http://schemas.microsoft.com/office/drawing/2016/5/12/chartex" xmlns:cx7="http://schemas.microsoft.com/office/drawing/2016/5/13/chartex" xmlns:cx8="http://schemas.microsoft.com/office/drawing/2016/5/14/chartex" xmlns:mc="http://schemas.openxmlformats.org/markup-compatibility/2006" xmlns:aink="http://schemas.microsoft.com/office/drawing/2016/ink" xmlns:am3d="http://schemas.microsoft.com/office/drawing/2017/model3d" xmlns:o="urn:schemas-microsoft-com:office:office" xmlns:oel="http://schemas.microsoft.com/office/2019/extlst" xmlns:r="http://schemas.openxmlformats.org/officeDocument/2006/relationships" xmlns:m="http://schemas.openxmlformats.org/officeDocument/2006/math" xmlns:v="urn:schemas-microsoft-com:vml" xmlns:wp14="http://schemas.microsoft.com/office/word/2010/wordprocessingDrawing" xmlns:wp="http://schemas.openxmlformats.org/drawingml/2006/wordprocessingDrawing" xmlns:w10="urn:schemas-microsoft-com:office:word" xmlns:w="http://schemas.openxmlformats.org/wordprocessingml/2006/main" xmlns:w14="http://schemas.microsoft.com/office/word/2010/wordml" xmlns:w15="http://schemas.microsoft.com/office/word/2012/wordml" xmlns:w16cex="http://schemas.microsoft.com/office/word/2018/wordml/cex" xmlns:w16cid="http://schemas.microsoft.com/office/word/2016/wordml/cid" xmlns:w16="http://schemas.microsoft.com/office/word/2018/wordml" xmlns:w16sdtdh="http://schemas.microsoft.com/office/word/2020/wordml/sdtdatahash" xmlns:w16se="http://schemas.microsoft.com/office/word/2015/wordml/symex" xmlns:wpg="http://schemas.microsoft.com/office/word/2010/wordprocessingGroup" xmlns:wpi="http://schemas.microsoft.com/office/word/2010/wordprocessingInk" xmlns:wne="http://schemas.microsoft.com/office/word/2006/wordml" xmlns:wps="http://schemas.microsoft.com/office/word/2010/wordprocessingShape" mc:Ignorable="w14 w15 w16se w16cid w16 w16cex w16sdtdh wp14">
+<w:document xmlns:o="urn:schemas-microsoft-com:office:office" xmlns:r="http://schemas.openxmlformats.org/officeDocument/2006/relationships" xmlns:v="urn:schemas-microsoft-com:vml" xmlns:w="http://schemas.openxmlformats.org/wordprocessingml/2006/main" xmlns:w10="urn:schemas-microsoft-com:office:word" xmlns:wp="http://schemas.openxmlformats.org/drawingml/2006/wordprocessingDrawing" xmlns:wps="http://schemas.microsoft.com/office/word/2010/wordprocessingShape" xmlns:wpg="http://schemas.microsoft.com/office/word/2010/wordprocessingGroup" xmlns:mc="http://schemas.openxmlformats.org/markup-compatibility/2006" xmlns:wp14="http://schemas.microsoft.com/office/word/2010/wordprocessingDrawing" xmlns:w14="http://schemas.microsoft.com/office/word/2010/wordml" xmlns:w15="http://schemas.microsoft.com/office/word/2012/wordml" mc:Ignorable="w14 wp14 w15">
   <w:body>
     <w:p>
       <w:pPr>
+        <w:pStyle w:val="Normal"/>
         <w:rPr>
           <w:lang w:val="fr-CA"/>
         </w:rPr>
@@ -17,13 +18,20 @@
     </w:p>
     <w:p>
       <w:pPr>
+        <w:pStyle w:val="Normal"/>
         <w:rPr>
           <w:lang w:val="fr-CA"/>
         </w:rPr>
       </w:pPr>
+      <w:r>
+        <w:rPr>
+          <w:lang w:val="fr-CA"/>
+        </w:rPr>
+      </w:r>
     </w:p>
     <w:p>
       <w:pPr>
+        <w:pStyle w:val="Normal"/>
         <w:rPr>
           <w:lang w:val="fr-CA"/>
         </w:rPr>
@@ -32,122 +40,274 @@
         <w:rPr>
           <w:lang w:val="fr-CA"/>
         </w:rPr>
-        <w:t>Texte</w:t>
-      </w:r>
-      <w:r>
-        <w:rPr>
-          <w:lang w:val="fr-CA"/>
-        </w:rPr>
-        <w:t xml:space="preserve"> de motivation pour la bourse </w:t>
-      </w:r>
-      <w:r>
-        <w:rPr>
-          <w:lang w:val="fr-CA"/>
-        </w:rPr>
-        <w:t>« </w:t>
-      </w:r>
-      <w:r>
-        <w:rPr>
-          <w:lang w:val="fr-CA"/>
-        </w:rPr>
-        <w:t>Persévérance</w:t>
-      </w:r>
-      <w:r>
-        <w:rPr>
-          <w:lang w:val="fr-CA"/>
-        </w:rPr>
-        <w:t> »</w:t>
+        <w:t>Texte de motivation pour la bourse « Persévérance »</w:t>
       </w:r>
     </w:p>
     <w:p>
       <w:pPr>
+        <w:pStyle w:val="Normal"/>
         <w:rPr>
           <w:lang w:val="fr-CA"/>
         </w:rPr>
       </w:pPr>
+      <w:r>
+        <w:rPr>
+          <w:lang w:val="fr-CA"/>
+        </w:rPr>
+      </w:r>
     </w:p>
     <w:p>
       <w:pPr>
+        <w:pStyle w:val="Normal"/>
         <w:rPr>
           <w:lang w:val="fr-CA"/>
         </w:rPr>
       </w:pPr>
       <w:r>
-        <w:rPr>
-          <w:lang w:val="fr-CA"/>
-        </w:rPr>
-        <w:t xml:space="preserve">J’ai eu un parcours semez d’embuches ce qui as retardé mon parcours scolaire. Cependant, j’ai toujours continué à aller de l’avant car pour moi les études sont primordiales. Quand j’ai commencer le cégep en 2019, j’ai frappé un mur car, je pensais pouvoir faire comme au secondaire pour passer et j’ai appris que je devais être plus sérieux et </w:t>
-      </w:r>
-      <w:r>
-        <w:rPr>
-          <w:lang w:val="fr-CA"/>
-        </w:rPr>
-        <w:t>que je devais donné d’avantage d’effort ce que j’ai entrepris après ma première session. En 2020, mon travail à eu une énorme baisse de production ce qui à entrainer la mise à porte de nombreux employés incluant moi. Pendant cette session de cégep, je stressais à cause que je ne trouvais pas d’autre emplois, que je devais quand même toujours payé mon transport, ma prochaine session, ma nourriture, mes cours de conduites et mes effets personnelles. Le stresse augmentais aussi car</w:t>
-      </w:r>
-      <w:r>
-        <w:rPr>
-          <w:lang w:val="fr-CA"/>
-        </w:rPr>
-        <w:t>,</w:t>
-      </w:r>
-      <w:r>
-        <w:rPr>
-          <w:lang w:val="fr-CA"/>
-        </w:rPr>
-        <w:t xml:space="preserve"> je voyais que mes économies rétrécissaient </w:t>
-      </w:r>
-      <w:r>
-        <w:rPr>
-          <w:lang w:val="fr-CA"/>
-        </w:rPr>
-        <w:t>à vue d’œil ainsi que mes notes à l’école. J’ai donné le plus d’effort possible pour passer le plus de cour</w:t>
-      </w:r>
-      <w:r>
-        <w:rPr>
-          <w:lang w:val="fr-CA"/>
-        </w:rPr>
-        <w:t>s possible</w:t>
-      </w:r>
-      <w:r>
-        <w:rPr>
-          <w:lang w:val="fr-CA"/>
-        </w:rPr>
-        <w:t xml:space="preserve"> à ce moment-là.</w:t>
-      </w:r>
-      <w:r>
-        <w:rPr>
-          <w:lang w:val="fr-CA"/>
-        </w:rPr>
-        <w:t xml:space="preserve"> Durant les périodes que ça n’allait pas bien je pensais a peut-être débarqué du cégep le temps que je me trouve quelque chose d’autre mais, je n’ai pas lâcher prise parce que je me disais que je n’étais pas si loin du bût et que même avec des économies restreintes je dois donner mon maximum pour l’école.</w:t>
-      </w:r>
-      <w:r>
-        <w:rPr>
-          <w:lang w:val="fr-CA"/>
+        <w:rPr/>
+        <w:t xml:space="preserve">J’ai eu un parcours, semez d'embuches ce qui a retardé mon parcours scolaire. Cependant, j’ai toujours continué à aller </w:t>
+      </w:r>
+      <w:r>
+        <w:rPr/>
+        <w:t>de l’avant,</w:t>
+      </w:r>
+      <w:r>
+        <w:rPr/>
+        <w:t xml:space="preserve"> car pour moi les études sont primordiales.</w:t>
+      </w:r>
+      <w:r>
+        <w:rPr>
+          <w:color w:val="7D7D7D"/>
         </w:rPr>
         <w:t xml:space="preserve"> </w:t>
       </w:r>
       <w:r>
-        <w:rPr>
-          <w:lang w:val="fr-CA"/>
-        </w:rPr>
-        <w:t xml:space="preserve">La session qui à suivi j’ai réussi à me trouver un autre travail et j’ai quand même continuer à </w:t>
-      </w:r>
-      <w:r>
-        <w:rPr>
-          <w:lang w:val="fr-CA"/>
-        </w:rPr>
-        <w:t>aller de l’avant avec le cégep même si j’ai passé par des passages plus difficiles.</w:t>
+        <w:rPr/>
+        <w:t xml:space="preserve">Quand, j’ai </w:t>
+      </w:r>
+      <w:r>
+        <w:rPr/>
+        <w:t>commencé</w:t>
+      </w:r>
+      <w:r>
+        <w:rPr/>
+        <w:t xml:space="preserve"> le cégep en 2019, j’ai frappé un </w:t>
+      </w:r>
+      <w:r>
+        <w:rPr/>
+        <w:t>mur,</w:t>
+      </w:r>
+      <w:r>
+        <w:rPr/>
+        <w:t xml:space="preserve"> car, je pensais pouvoir faire comme au secondaire pour passer et j’ai appris que je devais être plus sérieux et que je devais donné </w:t>
+      </w:r>
+      <w:r>
+        <w:rPr/>
+        <w:t>davantage</w:t>
+      </w:r>
+      <w:r>
+        <w:rPr/>
+        <w:t xml:space="preserve"> d’effort ce que j’ai entrepris après ma première session. En 2020, mon emploi à eu une énorme baisse de </w:t>
+      </w:r>
+      <w:r>
+        <w:rPr/>
+        <w:t>production,</w:t>
+      </w:r>
+      <w:r>
+        <w:rPr/>
+        <w:t xml:space="preserve"> ce qui à entrainer la mise à porte de nombreux employés incluant moi en plein milieu d’une </w:t>
+      </w:r>
+      <w:r>
+        <w:rPr/>
+        <w:t>session</w:t>
+      </w:r>
+      <w:r>
+        <w:rPr/>
+        <w:t>.</w:t>
+      </w:r>
+      <w:r>
+        <w:rPr>
+          <w:color w:val="7D7D7D"/>
+        </w:rPr>
+        <w:t xml:space="preserve"> </w:t>
+      </w:r>
+      <w:r>
+        <w:rPr/>
+        <w:t xml:space="preserve">Pendant cette </w:t>
+      </w:r>
+      <w:r>
+        <w:rPr/>
+        <w:t>session</w:t>
+      </w:r>
+      <w:r>
+        <w:rPr/>
+        <w:t xml:space="preserve"> de cégep, je stressais </w:t>
+      </w:r>
+      <w:r>
+        <w:rPr/>
+        <w:t>à cause que</w:t>
+      </w:r>
+      <w:r>
+        <w:rPr/>
+        <w:t xml:space="preserve"> je ne trouvais pas d’autre emploi, que je devais quand même toujours </w:t>
+      </w:r>
+      <w:r>
+        <w:rPr/>
+        <w:t>payer</w:t>
+      </w:r>
+      <w:r>
+        <w:rPr/>
+        <w:t xml:space="preserve"> mon transport, ma prochaine session, ma nourriture, mes cours de conduites et mes livres et mes effets </w:t>
+      </w:r>
+      <w:r>
+        <w:rPr/>
+        <w:t>personnels</w:t>
+      </w:r>
+      <w:r>
+        <w:rPr/>
+        <w:t>.</w:t>
+      </w:r>
+      <w:r>
+        <w:rPr>
+          <w:color w:val="7D7D7D"/>
+        </w:rPr>
+        <w:t xml:space="preserve"> </w:t>
+      </w:r>
+      <w:r>
+        <w:rPr/>
+        <w:t xml:space="preserve">Ce stresse augmentais encore plus, car, je voyais que mes économies </w:t>
+      </w:r>
+      <w:r>
+        <w:rPr/>
+        <w:t>rétrécirent</w:t>
+      </w:r>
+      <w:r>
+        <w:rPr/>
+        <w:t xml:space="preserve"> à vue d’œil ainsi que mes notes à l’école. J’ai donné le plus d’effort possible pour passer mes </w:t>
+      </w:r>
+      <w:r>
+        <w:rPr/>
+        <w:t>cours</w:t>
+      </w:r>
+      <w:r>
+        <w:rPr/>
+        <w:t xml:space="preserve"> à ce moment-là. Durant cette période qui n’allait pas bien je pensais a débarqué du cégep le temps que je me trouve un emploi de fin de semaine et aller travailler de semaine pour être capable de subvenir à mes dépenses. Les dépenses ne s’arrêtaient pas parce que j’ai seulement perdu mon emploi.</w:t>
+      </w:r>
+      <w:r>
+        <w:rPr>
+          <w:color w:val="7D7D7D"/>
+        </w:rPr>
+        <w:t xml:space="preserve"> </w:t>
+      </w:r>
+      <w:r>
+        <w:rPr/>
+        <w:t>Parcontre</w:t>
+      </w:r>
+      <w:r>
+        <w:rPr/>
+        <w:t xml:space="preserve">, je n’ai pas </w:t>
+      </w:r>
+      <w:r>
+        <w:rPr/>
+        <w:t>lâché</w:t>
+      </w:r>
+      <w:r>
+        <w:rPr/>
+        <w:t xml:space="preserve"> prise parce que je me disais que je n’étais pas si loin de mon </w:t>
+      </w:r>
+      <w:r>
+        <w:rPr/>
+        <w:t>but</w:t>
+      </w:r>
+      <w:r>
+        <w:rPr/>
+        <w:t xml:space="preserve"> qui est d’obtenir mon diplôme et d’aller à l’université.</w:t>
+      </w:r>
+      <w:r>
+        <w:rPr>
+          <w:color w:val="7D7D7D"/>
+        </w:rPr>
+        <w:t xml:space="preserve"> </w:t>
+      </w:r>
+      <w:r>
+        <w:rPr/>
+        <w:t xml:space="preserve">Je me </w:t>
+      </w:r>
+      <w:r>
+        <w:rPr/>
+        <w:t>disais</w:t>
+      </w:r>
+      <w:r>
+        <w:rPr/>
+        <w:t xml:space="preserve"> que même avec des économies restreintes, je dois donner mon maximum pour au cégep.</w:t>
+      </w:r>
+      <w:r>
+        <w:rPr>
+          <w:color w:val="7D7D7D"/>
+        </w:rPr>
+        <w:t xml:space="preserve"> </w:t>
+      </w:r>
+      <w:r>
+        <w:rPr/>
+        <w:t xml:space="preserve">La session qui </w:t>
+      </w:r>
+      <w:r>
+        <w:rPr/>
+        <w:t>a</w:t>
+      </w:r>
+      <w:r>
+        <w:rPr/>
+        <w:t xml:space="preserve"> </w:t>
+      </w:r>
+      <w:r>
+        <w:rPr/>
+        <w:t>suivi,</w:t>
+      </w:r>
+      <w:r>
+        <w:rPr/>
+        <w:t xml:space="preserve"> j’ai réussi à me trouver un autre travail et j’ai </w:t>
+      </w:r>
+      <w:r>
+        <w:rPr/>
+        <w:t>su</w:t>
+      </w:r>
+      <w:r>
+        <w:rPr/>
+        <w:t xml:space="preserve"> m’accrocher pour continuer à aller de l’avant avec le cégep même si j’</w:t>
+      </w:r>
+      <w:r>
+        <w:rPr/>
+        <w:t>ai</w:t>
+      </w:r>
+      <w:r>
+        <w:rPr/>
+        <w:t xml:space="preserve"> passé par </w:t>
+      </w:r>
+      <w:r>
+        <w:rPr/>
+        <w:t>de</w:t>
+      </w:r>
+      <w:r>
+        <w:rPr/>
+        <w:t xml:space="preserve"> durs moments.</w:t>
       </w:r>
     </w:p>
     <w:p>
       <w:pPr>
+        <w:pStyle w:val="Normal"/>
         <w:rPr>
           <w:lang w:val="fr-CA"/>
         </w:rPr>
       </w:pPr>
+      <w:r>
+        <w:rPr>
+          <w:lang w:val="fr-CA"/>
+        </w:rPr>
+      </w:r>
     </w:p>
     <w:p>
       <w:pPr>
+        <w:pStyle w:val="Normal"/>
         <w:rPr>
           <w:lang w:val="fr-CA"/>
         </w:rPr>
@@ -161,6 +321,8 @@
     </w:p>
     <w:p>
       <w:pPr>
+        <w:pStyle w:val="Normal"/>
+        <w:spacing w:before="0" w:after="160"/>
         <w:rPr>
           <w:lang w:val="fr-CA"/>
         </w:rPr>
@@ -173,21 +335,24 @@
       </w:r>
     </w:p>
     <w:sectPr>
+      <w:type w:val="nextPage"/>
       <w:pgSz w:w="12240" w:h="15840"/>
-      <w:pgMar w:top="1440" w:right="1440" w:bottom="1440" w:left="1440" w:header="720" w:footer="720" w:gutter="0"/>
-      <w:cols w:space="720"/>
-      <w:docGrid w:linePitch="360"/>
+      <w:pgMar w:left="1440" w:right="1440" w:gutter="0" w:header="0" w:top="1440" w:footer="0" w:bottom="1440"/>
+      <w:pgNumType w:fmt="decimal"/>
+      <w:formProt w:val="false"/>
+      <w:textDirection w:val="lrTb"/>
+      <w:docGrid w:type="default" w:linePitch="360" w:charSpace="4096"/>
     </w:sectPr>
   </w:body>
 </w:document>
 </file>
 
 <file path=word/styles.xml><?xml version="1.0" encoding="utf-8"?>
-<w:styles xmlns:mc="http://schemas.openxmlformats.org/markup-compatibility/2006" xmlns:r="http://schemas.openxmlformats.org/officeDocument/2006/relationships" xmlns:w="http://schemas.openxmlformats.org/wordprocessingml/2006/main" xmlns:w14="http://schemas.microsoft.com/office/word/2010/wordml" xmlns:w15="http://schemas.microsoft.com/office/word/2012/wordml" xmlns:w16cex="http://schemas.microsoft.com/office/word/2018/wordml/cex" xmlns:w16cid="http://schemas.microsoft.com/office/word/2016/wordml/cid" xmlns:w16="http://schemas.microsoft.com/office/word/2018/wordml" xmlns:w16sdtdh="http://schemas.microsoft.com/office/word/2020/wordml/sdtdatahash" xmlns:w16se="http://schemas.microsoft.com/office/word/2015/wordml/symex" mc:Ignorable="w14 w15 w16se w16cid w16 w16cex w16sdtdh">
+<w:styles xmlns:w="http://schemas.openxmlformats.org/wordprocessingml/2006/main" xmlns:w14="http://schemas.microsoft.com/office/word/2010/wordml" xmlns:mc="http://schemas.openxmlformats.org/markup-compatibility/2006" mc:Ignorable="w14">
   <w:docDefaults>
     <w:rPrDefault>
       <w:rPr>
-        <w:rFonts w:asciiTheme="minorHAnsi" w:eastAsiaTheme="minorHAnsi" w:hAnsiTheme="minorHAnsi" w:cstheme="minorBidi"/>
+        <w:rFonts w:ascii="Calibri" w:hAnsi="Calibri" w:eastAsia="Calibri" w:cs="" w:asciiTheme="minorHAnsi" w:cstheme="minorBidi" w:eastAsiaTheme="minorHAnsi" w:hAnsiTheme="minorHAnsi"/>
         <w:sz w:val="22"/>
         <w:szCs w:val="22"/>
         <w:lang w:val="en-US" w:eastAsia="en-US" w:bidi="ar-SA"/>
@@ -195,21 +360,21 @@
     </w:rPrDefault>
     <w:pPrDefault>
       <w:pPr>
-        <w:spacing w:after="160" w:line="259" w:lineRule="auto"/>
+        <w:suppressAutoHyphens w:val="true"/>
       </w:pPr>
     </w:pPrDefault>
   </w:docDefaults>
   <w:latentStyles w:defLockedState="0" w:defUIPriority="99" w:defSemiHidden="0" w:defUnhideWhenUsed="0" w:defQFormat="0" w:count="376">
     <w:lsdException w:name="Normal" w:uiPriority="0" w:qFormat="1"/>
     <w:lsdException w:name="heading 1" w:uiPriority="9" w:qFormat="1"/>
-    <w:lsdException w:name="heading 2" w:semiHidden="1" w:uiPriority="9" w:unhideWhenUsed="1" w:qFormat="1"/>
-    <w:lsdException w:name="heading 3" w:semiHidden="1" w:uiPriority="9" w:unhideWhenUsed="1" w:qFormat="1"/>
-    <w:lsdException w:name="heading 4" w:semiHidden="1" w:uiPriority="9" w:unhideWhenUsed="1" w:qFormat="1"/>
-    <w:lsdException w:name="heading 5" w:semiHidden="1" w:uiPriority="9" w:unhideWhenUsed="1" w:qFormat="1"/>
-    <w:lsdException w:name="heading 6" w:semiHidden="1" w:uiPriority="9" w:unhideWhenUsed="1" w:qFormat="1"/>
-    <w:lsdException w:name="heading 7" w:semiHidden="1" w:uiPriority="9" w:unhideWhenUsed="1" w:qFormat="1"/>
-    <w:lsdException w:name="heading 8" w:semiHidden="1" w:uiPriority="9" w:unhideWhenUsed="1" w:qFormat="1"/>
-    <w:lsdException w:name="heading 9" w:semiHidden="1" w:uiPriority="9" w:unhideWhenUsed="1" w:qFormat="1"/>
+    <w:lsdException w:name="heading 2" w:uiPriority="9" w:semiHidden="1" w:unhideWhenUsed="1" w:qFormat="1"/>
+    <w:lsdException w:name="heading 3" w:uiPriority="9" w:semiHidden="1" w:unhideWhenUsed="1" w:qFormat="1"/>
+    <w:lsdException w:name="heading 4" w:uiPriority="9" w:semiHidden="1" w:unhideWhenUsed="1" w:qFormat="1"/>
+    <w:lsdException w:name="heading 5" w:uiPriority="9" w:semiHidden="1" w:unhideWhenUsed="1" w:qFormat="1"/>
+    <w:lsdException w:name="heading 6" w:uiPriority="9" w:semiHidden="1" w:unhideWhenUsed="1" w:qFormat="1"/>
+    <w:lsdException w:name="heading 7" w:uiPriority="9" w:semiHidden="1" w:unhideWhenUsed="1" w:qFormat="1"/>
+    <w:lsdException w:name="heading 8" w:uiPriority="9" w:semiHidden="1" w:unhideWhenUsed="1" w:qFormat="1"/>
+    <w:lsdException w:name="heading 9" w:uiPriority="9" w:semiHidden="1" w:unhideWhenUsed="1" w:qFormat="1"/>
     <w:lsdException w:name="index 1" w:semiHidden="1" w:unhideWhenUsed="1"/>
     <w:lsdException w:name="index 2" w:semiHidden="1" w:unhideWhenUsed="1"/>
     <w:lsdException w:name="index 3" w:semiHidden="1" w:unhideWhenUsed="1"/>
@@ -219,22 +384,22 @@
     <w:lsdException w:name="index 7" w:semiHidden="1" w:unhideWhenUsed="1"/>
     <w:lsdException w:name="index 8" w:semiHidden="1" w:unhideWhenUsed="1"/>
     <w:lsdException w:name="index 9" w:semiHidden="1" w:unhideWhenUsed="1"/>
-    <w:lsdException w:name="toc 1" w:semiHidden="1" w:uiPriority="39" w:unhideWhenUsed="1"/>
-    <w:lsdException w:name="toc 2" w:semiHidden="1" w:uiPriority="39" w:unhideWhenUsed="1"/>
-    <w:lsdException w:name="toc 3" w:semiHidden="1" w:uiPriority="39" w:unhideWhenUsed="1"/>
-    <w:lsdException w:name="toc 4" w:semiHidden="1" w:uiPriority="39" w:unhideWhenUsed="1"/>
-    <w:lsdException w:name="toc 5" w:semiHidden="1" w:uiPriority="39" w:unhideWhenUsed="1"/>
-    <w:lsdException w:name="toc 6" w:semiHidden="1" w:uiPriority="39" w:unhideWhenUsed="1"/>
-    <w:lsdException w:name="toc 7" w:semiHidden="1" w:uiPriority="39" w:unhideWhenUsed="1"/>
-    <w:lsdException w:name="toc 8" w:semiHidden="1" w:uiPriority="39" w:unhideWhenUsed="1"/>
-    <w:lsdException w:name="toc 9" w:semiHidden="1" w:uiPriority="39" w:unhideWhenUsed="1"/>
+    <w:lsdException w:name="toc 1" w:uiPriority="39" w:semiHidden="1" w:unhideWhenUsed="1"/>
+    <w:lsdException w:name="toc 2" w:uiPriority="39" w:semiHidden="1" w:unhideWhenUsed="1"/>
+    <w:lsdException w:name="toc 3" w:uiPriority="39" w:semiHidden="1" w:unhideWhenUsed="1"/>
+    <w:lsdException w:name="toc 4" w:uiPriority="39" w:semiHidden="1" w:unhideWhenUsed="1"/>
+    <w:lsdException w:name="toc 5" w:uiPriority="39" w:semiHidden="1" w:unhideWhenUsed="1"/>
+    <w:lsdException w:name="toc 6" w:uiPriority="39" w:semiHidden="1" w:unhideWhenUsed="1"/>
+    <w:lsdException w:name="toc 7" w:uiPriority="39" w:semiHidden="1" w:unhideWhenUsed="1"/>
+    <w:lsdException w:name="toc 8" w:uiPriority="39" w:semiHidden="1" w:unhideWhenUsed="1"/>
+    <w:lsdException w:name="toc 9" w:uiPriority="39" w:semiHidden="1" w:unhideWhenUsed="1"/>
     <w:lsdException w:name="Normal Indent" w:semiHidden="1" w:unhideWhenUsed="1"/>
     <w:lsdException w:name="footnote text" w:semiHidden="1" w:unhideWhenUsed="1"/>
     <w:lsdException w:name="annotation text" w:semiHidden="1" w:unhideWhenUsed="1"/>
     <w:lsdException w:name="header" w:semiHidden="1" w:unhideWhenUsed="1"/>
     <w:lsdException w:name="footer" w:semiHidden="1" w:unhideWhenUsed="1"/>
     <w:lsdException w:name="index heading" w:semiHidden="1" w:unhideWhenUsed="1"/>
-    <w:lsdException w:name="caption" w:semiHidden="1" w:uiPriority="35" w:unhideWhenUsed="1" w:qFormat="1"/>
+    <w:lsdException w:name="caption" w:uiPriority="35" w:semiHidden="1" w:unhideWhenUsed="1" w:qFormat="1"/>
     <w:lsdException w:name="table of figures" w:semiHidden="1" w:unhideWhenUsed="1"/>
     <w:lsdException w:name="envelope address" w:semiHidden="1" w:unhideWhenUsed="1"/>
     <w:lsdException w:name="envelope return" w:semiHidden="1" w:unhideWhenUsed="1"/>
@@ -265,7 +430,7 @@
     <w:lsdException w:name="Title" w:uiPriority="10" w:qFormat="1"/>
     <w:lsdException w:name="Closing" w:semiHidden="1" w:unhideWhenUsed="1"/>
     <w:lsdException w:name="Signature" w:semiHidden="1" w:unhideWhenUsed="1"/>
-    <w:lsdException w:name="Default Paragraph Font" w:semiHidden="1" w:uiPriority="1" w:unhideWhenUsed="1"/>
+    <w:lsdException w:name="Default Paragraph Font" w:uiPriority="1" w:semiHidden="1" w:unhideWhenUsed="1"/>
     <w:lsdException w:name="Body Text" w:semiHidden="1" w:unhideWhenUsed="1"/>
     <w:lsdException w:name="Body Text Indent" w:semiHidden="1" w:unhideWhenUsed="1"/>
     <w:lsdException w:name="List Continue" w:semiHidden="1" w:unhideWhenUsed="1"/>
@@ -465,8 +630,8 @@
     <w:lsdException w:name="Subtle Reference" w:uiPriority="31" w:qFormat="1"/>
     <w:lsdException w:name="Intense Reference" w:uiPriority="32" w:qFormat="1"/>
     <w:lsdException w:name="Book Title" w:uiPriority="33" w:qFormat="1"/>
-    <w:lsdException w:name="Bibliography" w:semiHidden="1" w:uiPriority="37" w:unhideWhenUsed="1"/>
-    <w:lsdException w:name="TOC Heading" w:semiHidden="1" w:uiPriority="39" w:unhideWhenUsed="1" w:qFormat="1"/>
+    <w:lsdException w:name="Bibliography" w:uiPriority="37" w:semiHidden="1" w:unhideWhenUsed="1"/>
+    <w:lsdException w:name="TOC Heading" w:uiPriority="39" w:semiHidden="1" w:unhideWhenUsed="1" w:qFormat="1"/>
     <w:lsdException w:name="Plain Table 1" w:uiPriority="41"/>
     <w:lsdException w:name="Plain Table 2" w:uiPriority="42"/>
     <w:lsdException w:name="Plain Table 3" w:uiPriority="43"/>
@@ -577,15 +742,97 @@
     <w:lsdException w:name="Unresolved Mention" w:semiHidden="1" w:unhideWhenUsed="1"/>
     <w:lsdException w:name="Smart Link" w:semiHidden="1" w:unhideWhenUsed="1"/>
   </w:latentStyles>
-  <w:style w:type="paragraph" w:default="1" w:styleId="Normal">
+  <w:style w:type="paragraph" w:styleId="Normal" w:default="1">
     <w:name w:val="Normal"/>
     <w:qFormat/>
+    <w:pPr>
+      <w:widowControl/>
+      <w:bidi w:val="0"/>
+      <w:spacing w:lineRule="auto" w:line="259" w:before="0" w:after="160"/>
+      <w:jc w:val="left"/>
+    </w:pPr>
+    <w:rPr>
+      <w:rFonts w:ascii="Calibri" w:hAnsi="Calibri" w:eastAsia="Calibri" w:cs="" w:asciiTheme="minorHAnsi" w:cstheme="minorBidi" w:eastAsiaTheme="minorHAnsi" w:hAnsiTheme="minorHAnsi"/>
+      <w:color w:val="auto"/>
+      <w:kern w:val="0"/>
+      <w:sz w:val="22"/>
+      <w:szCs w:val="22"/>
+      <w:lang w:val="en-US" w:eastAsia="en-US" w:bidi="ar-SA"/>
+    </w:rPr>
   </w:style>
-  <w:style w:type="character" w:default="1" w:styleId="Policepardfaut">
+  <w:style w:type="character" w:styleId="DefaultParagraphFont" w:default="1">
     <w:name w:val="Default Paragraph Font"/>
     <w:uiPriority w:val="1"/>
     <w:semiHidden/>
     <w:unhideWhenUsed/>
+    <w:qFormat/>
+    <w:rPr/>
+  </w:style>
+  <w:style w:type="paragraph" w:styleId="Heading">
+    <w:name w:val="Heading"/>
+    <w:basedOn w:val="Normal"/>
+    <w:next w:val="TextBody"/>
+    <w:qFormat/>
+    <w:pPr>
+      <w:keepNext w:val="true"/>
+      <w:spacing w:before="240" w:after="120"/>
+    </w:pPr>
+    <w:rPr>
+      <w:rFonts w:ascii="Liberation Sans" w:hAnsi="Liberation Sans" w:eastAsia="Noto Sans CJK SC" w:cs="Lohit Devanagari"/>
+      <w:sz w:val="28"/>
+      <w:szCs w:val="28"/>
+    </w:rPr>
+  </w:style>
+  <w:style w:type="paragraph" w:styleId="TextBody">
+    <w:name w:val="Body Text"/>
+    <w:basedOn w:val="Normal"/>
+    <w:pPr>
+      <w:spacing w:lineRule="auto" w:line="276" w:before="0" w:after="140"/>
+    </w:pPr>
+    <w:rPr/>
+  </w:style>
+  <w:style w:type="paragraph" w:styleId="List">
+    <w:name w:val="List"/>
+    <w:basedOn w:val="TextBody"/>
+    <w:pPr/>
+    <w:rPr>
+      <w:rFonts w:cs="Lohit Devanagari"/>
+    </w:rPr>
+  </w:style>
+  <w:style w:type="paragraph" w:styleId="Caption">
+    <w:name w:val="Caption"/>
+    <w:basedOn w:val="Normal"/>
+    <w:qFormat/>
+    <w:pPr>
+      <w:suppressLineNumbers/>
+      <w:spacing w:before="120" w:after="120"/>
+    </w:pPr>
+    <w:rPr>
+      <w:rFonts w:cs="Lohit Devanagari"/>
+      <w:i/>
+      <w:iCs/>
+      <w:sz w:val="24"/>
+      <w:szCs w:val="24"/>
+    </w:rPr>
+  </w:style>
+  <w:style w:type="paragraph" w:styleId="Index">
+    <w:name w:val="Index"/>
+    <w:basedOn w:val="Normal"/>
+    <w:qFormat/>
+    <w:pPr>
+      <w:suppressLineNumbers/>
+    </w:pPr>
+    <w:rPr>
+      <w:rFonts w:cs="Lohit Devanagari"/>
+      <w:lang w:val="zxx" w:eastAsia="zxx" w:bidi="zxx"/>
+    </w:rPr>
+  </w:style>
+  <w:style w:type="numbering" w:styleId="NoList" w:default="1">
+    <w:name w:val="No List"/>
+    <w:uiPriority w:val="99"/>
+    <w:semiHidden/>
+    <w:unhideWhenUsed/>
+    <w:qFormat/>
   </w:style>
   <w:style w:type="table" w:default="1" w:styleId="TableauNormal">
     <w:name w:val="Normal Table"/>
@@ -593,7 +840,6 @@
     <w:semiHidden/>
     <w:unhideWhenUsed/>
     <w:tblPr>
-      <w:tblInd w:w="0" w:type="dxa"/>
       <w:tblCellMar>
         <w:top w:w="0" w:type="dxa"/>
         <w:left w:w="108" w:type="dxa"/>
@@ -601,12 +847,6 @@
         <w:right w:w="108" w:type="dxa"/>
       </w:tblCellMar>
     </w:tblPr>
-  </w:style>
-  <w:style w:type="numbering" w:default="1" w:styleId="Aucuneliste">
-    <w:name w:val="No List"/>
-    <w:uiPriority w:val="99"/>
-    <w:semiHidden/>
-    <w:unhideWhenUsed/>
   </w:style>
 </w:styles>
 </file>

</xml_diff>